<commit_message>
feat(database): adiciona persistencia de nao conformidades
</commit_message>
<xml_diff>
--- a/src/reports/relatorio_1.docx
+++ b/src/reports/relatorio_1.docx
@@ -51,7 +51,7 @@
               <a:graphicData uri="http://schemas.openxmlformats.org/drawingml/2006/picture">
                 <pic:pic>
                   <pic:nvPicPr>
-                    <pic:cNvPr id="0" name="logo_capa.jpeg"/>
+                    <pic:cNvPr id="0" name="capa_2.jpeg"/>
                     <pic:cNvPicPr/>
                   </pic:nvPicPr>
                   <pic:blipFill>
@@ -697,7 +697,7 @@
       <w:pPr>
         <w:tabs>
           <w:tab w:pos="720" w:val="left"/>
-          <w:tab w:pos="10800" w:val="right" w:leader="dot"/>
+          <w:tab w:pos="10469" w:val="right" w:leader="dot"/>
         </w:tabs>
         <w:spacing w:after="120"/>
       </w:pPr>
@@ -734,7 +734,7 @@
       <w:pPr>
         <w:tabs>
           <w:tab w:pos="720" w:val="left"/>
-          <w:tab w:pos="10800" w:val="right" w:leader="dot"/>
+          <w:tab w:pos="10469" w:val="right" w:leader="dot"/>
         </w:tabs>
         <w:spacing w:after="120"/>
       </w:pPr>
@@ -771,7 +771,7 @@
       <w:pPr>
         <w:tabs>
           <w:tab w:pos="720" w:val="left"/>
-          <w:tab w:pos="10800" w:val="right" w:leader="dot"/>
+          <w:tab w:pos="10469" w:val="right" w:leader="dot"/>
         </w:tabs>
         <w:spacing w:after="120"/>
       </w:pPr>
@@ -808,7 +808,7 @@
       <w:pPr>
         <w:tabs>
           <w:tab w:pos="720" w:val="left"/>
-          <w:tab w:pos="10800" w:val="right" w:leader="dot"/>
+          <w:tab w:pos="10469" w:val="right" w:leader="dot"/>
         </w:tabs>
         <w:spacing w:after="120"/>
       </w:pPr>
@@ -845,7 +845,7 @@
       <w:pPr>
         <w:tabs>
           <w:tab w:pos="720" w:val="left"/>
-          <w:tab w:pos="10800" w:val="right" w:leader="dot"/>
+          <w:tab w:pos="10469" w:val="right" w:leader="dot"/>
         </w:tabs>
         <w:spacing w:after="120"/>
       </w:pPr>
@@ -882,7 +882,7 @@
       <w:pPr>
         <w:tabs>
           <w:tab w:pos="720" w:val="left"/>
-          <w:tab w:pos="10800" w:val="right" w:leader="dot"/>
+          <w:tab w:pos="10469" w:val="right" w:leader="dot"/>
         </w:tabs>
         <w:spacing w:after="120"/>
       </w:pPr>
@@ -919,7 +919,7 @@
       <w:pPr>
         <w:tabs>
           <w:tab w:pos="720" w:val="left"/>
-          <w:tab w:pos="10800" w:val="right" w:leader="dot"/>
+          <w:tab w:pos="10469" w:val="right" w:leader="dot"/>
         </w:tabs>
         <w:spacing w:after="120"/>
       </w:pPr>
@@ -956,7 +956,7 @@
       <w:pPr>
         <w:tabs>
           <w:tab w:pos="720" w:val="left"/>
-          <w:tab w:pos="10800" w:val="right" w:leader="dot"/>
+          <w:tab w:pos="10469" w:val="right" w:leader="dot"/>
         </w:tabs>
         <w:spacing w:after="120"/>
       </w:pPr>
@@ -1118,7 +1118,7 @@
     <w:p/>
     <w:p>
       <w:pPr>
-        <w:spacing w:after="240" w:line="276" w:lineRule="auto"/>
+        <w:spacing w:after="120" w:line="276" w:lineRule="auto"/>
         <w:jc w:val="both"/>
       </w:pPr>
       <w:r>
@@ -2177,7 +2177,7 @@
           <w:i/>
           <w:sz w:val="18"/>
         </w:rPr>
-        <w:t>X - Fiscalizar diretamente ou mediante convênio com o Estado de Pernambuco, através de seus órgãos ou entidades vinculadas, com sua supervisão, os aspectos técnico, econômico, contábil, financeiro, operacional e jurídico dos serviços públicos delegados, valendo-se inclusive, de indicadores e procedimentos amostrais.</w:t>
+        <w:t>X - Fiscalizar diretamente ou mediante convênio com o Estado de Pernambuco, através de seus órgãos ou entidades vinculadas, com sua supervisão, os aspects técnico, econômico, contábil, financeiro, operacional e jurídico dos serviços públicos delegados, valendo-se inclusive, de indicadores e procedimentos amostrais.</w:t>
       </w:r>
     </w:p>
     <w:p/>
@@ -2246,7 +2246,7 @@
           <w:rFonts w:ascii="Aptos" w:hAnsi="Aptos"/>
           <w:sz w:val="22"/>
         </w:rPr>
-        <w:t>Norma DNIT 005/2003 – que define os termos técnicos empregados em defeitos que ocorrem nos pavimentos flexíveis e semirrígidos e serve para padronizar a linguagem adotada na elaboração das normas, manuais, projetos e textos relativos aos pavimentos flexíveis e semirrígidos.</w:t>
+        <w:t>Norma DNIT 005/2003 – que define os termos técnicos empregados in defeitos que ocorrem nos pavimentos flexíveis e semirrígidos e serve para padronizar a linguagem adotada na elaboração das normas, manuais, projetos e textos relativos aos pavimentos flexíveis e semirrígidos.</w:t>
       </w:r>
     </w:p>
     <w:p/>
@@ -2482,6 +2482,7 @@
       <w:r>
         <w:rPr>
           <w:rFonts w:ascii="Aptos" w:hAnsi="Aptos"/>
+          <w:sz w:val="22"/>
         </w:rPr>
         <w:t xml:space="preserve">As ações de fiscalização foram realizadas pela equipe formada pelos servidores: </w:t>
       </w:r>
@@ -2489,18 +2490,21 @@
         <w:rPr>
           <w:rFonts w:ascii="Aptos" w:hAnsi="Aptos"/>
           <w:b/>
+          <w:sz w:val="22"/>
         </w:rPr>
         <w:t>Alcides Vieira</w:t>
       </w:r>
       <w:r>
         <w:rPr>
           <w:rFonts w:ascii="Aptos" w:hAnsi="Aptos"/>
+          <w:sz w:val="22"/>
         </w:rPr>
         <w:t>, matrícula nº xxxxxxx/xx</w:t>
       </w:r>
       <w:r>
         <w:rPr>
           <w:rFonts w:ascii="Aptos" w:hAnsi="Aptos"/>
+          <w:sz w:val="22"/>
         </w:rPr>
         <w:t xml:space="preserve"> e </w:t>
       </w:r>
@@ -2508,18 +2512,21 @@
         <w:rPr>
           <w:rFonts w:ascii="Aptos" w:hAnsi="Aptos"/>
           <w:b/>
+          <w:sz w:val="22"/>
         </w:rPr>
         <w:t>Enildo Manoel</w:t>
       </w:r>
       <w:r>
         <w:rPr>
           <w:rFonts w:ascii="Aptos" w:hAnsi="Aptos"/>
+          <w:sz w:val="22"/>
         </w:rPr>
         <w:t>, matrícula nº xxxxxxx/xx</w:t>
       </w:r>
       <w:r>
         <w:rPr>
           <w:rFonts w:ascii="Aptos" w:hAnsi="Aptos"/>
+          <w:sz w:val="22"/>
         </w:rPr>
         <w:t xml:space="preserve"> nos dias 8 de junho de 2025. Nessas ações foram identificados 10 achados de fiscalização nas áreas sob concessão por meio de um levantamento de campo nas Rodovias com evidências de defeitos que poderiam se caracterizar Não Conformidades.</w:t>
       </w:r>
@@ -2553,8 +2560,8 @@
     <w:p/>
     <w:p>
       <w:pPr>
-        <w:spacing w:after="120"/>
-        <w:jc w:val="center"/>
+        <w:spacing w:after="120" w:line="276" w:lineRule="auto"/>
+        <w:jc w:val="both"/>
       </w:pPr>
       <w:r>
         <w:rPr>
@@ -2566,8 +2573,8 @@
     </w:p>
     <w:p>
       <w:pPr>
-        <w:spacing w:after="120"/>
-        <w:jc w:val="center"/>
+        <w:spacing w:after="120" w:line="276" w:lineRule="auto"/>
+        <w:jc w:val="both"/>
       </w:pPr>
       <w:r>
         <w:rPr>
@@ -2593,8 +2600,8 @@
     <w:p/>
     <w:p>
       <w:pPr>
-        <w:spacing w:after="120"/>
-        <w:jc w:val="center"/>
+        <w:spacing w:after="120" w:line="276" w:lineRule="auto"/>
+        <w:jc w:val="both"/>
       </w:pPr>
       <w:r>
         <w:rPr>
@@ -2604,7 +2611,6 @@
         <w:t>Quadro 3 – Trecho dos pontos de Atenção:</w:t>
       </w:r>
     </w:p>
-    <w:p/>
     <w:p>
       <w:pPr>
         <w:spacing w:after="120" w:line="276" w:lineRule="auto"/>
@@ -2615,22 +2621,7 @@
           <w:rFonts w:ascii="Aptos" w:hAnsi="Aptos"/>
           <w:sz w:val="22"/>
         </w:rPr>
-        <w:t xml:space="preserve">O </w:t>
-      </w:r>
-      <w:r>
-        <w:rPr>
-          <w:rFonts w:ascii="Aptos" w:hAnsi="Aptos"/>
-          <w:b/>
-          <w:sz w:val="22"/>
-        </w:rPr>
-        <w:t>Quadro 4</w:t>
-      </w:r>
-      <w:r>
-        <w:rPr>
-          <w:rFonts w:ascii="Aptos" w:hAnsi="Aptos"/>
-          <w:sz w:val="22"/>
-        </w:rPr>
-        <w:t xml:space="preserve">, a seguir, resume as Não Conformidades constatadas, relacionadas ao PDCL, com indicação dos respectivos registros fotográficos no </w:t>
+        <w:t xml:space="preserve">O Quadro 4, a seguir, resume as Não Conformidades constatadas, relacionadas ao PDCL, com indicação dos respectivos registros fotográficos no </w:t>
       </w:r>
       <w:r>
         <w:rPr>
@@ -2663,7 +2654,6 @@
         <w:t>. A descrição da evidência está referenciada conforme a norma de descrição de defeitos do DNIT.</w:t>
       </w:r>
     </w:p>
-    <w:p/>
     <w:p>
       <w:pPr>
         <w:spacing w:after="120"/>
@@ -3111,7 +3101,7 @@
           <w:rFonts w:ascii="Aptos" w:hAnsi="Aptos"/>
           <w:sz w:val="22"/>
         </w:rPr>
-        <w:t xml:space="preserve"> detalhando cronograma com trechos a executar de forma que permita à Arpe uma programação mais efetiva do monitoramento de suas soluções a execução de cada subtrecho, conforme o modelo encaminhado para 2024 (Cronograma de Conserva Especial do Pavimento CRA 2024).</w:t>
+        <w:t xml:space="preserve"> detalhando cronograma com trechos a executar de forma que permita à Arpe uma programação mais efetiva do monitoramento de suas soluções a execução de cada subtrecho, conforme o modelo encaminhado para {ano_anterior} (Cronograma de Conserva Especial do Pavimento CRA {ano_anterior}).</w:t>
       </w:r>
     </w:p>
     <w:p>
@@ -3168,8 +3158,17 @@
     <w:p>
       <w:pPr>
         <w:spacing w:after="120" w:line="276" w:lineRule="auto"/>
+        <w:ind w:left="360" w:hanging="360"/>
         <w:jc w:val="both"/>
       </w:pPr>
+      <w:r>
+        <w:rPr>
+          <w:rFonts w:ascii="Aptos" w:hAnsi="Aptos"/>
+          <w:sz w:val="22"/>
+        </w:rPr>
+        <w:t>•</w:t>
+        <w:tab/>
+      </w:r>
       <w:r>
         <w:rPr>
           <w:rFonts w:ascii="Aptos" w:hAnsi="Aptos"/>
@@ -3236,19 +3235,6 @@
     </w:p>
     <w:p>
       <w:pPr>
-        <w:spacing w:after="120"/>
-        <w:jc w:val="both"/>
-      </w:pPr>
-      <w:r>
-        <w:rPr>
-          <w:rFonts w:ascii="Aptos" w:hAnsi="Aptos"/>
-          <w:sz w:val="22"/>
-        </w:rPr>
-        <w:t>Recife, data da assinatura eletrônica.</w:t>
-      </w:r>
-    </w:p>
-    <w:p>
-      <w:pPr>
         <w:pStyle w:val="Heading3"/>
         <w:pageBreakBefore/>
         <w:spacing w:before="160" w:after="80"/>
@@ -3308,40 +3294,6 @@
               <w:ind w:left="0" w:firstLine="0"/>
               <w:jc w:val="center"/>
             </w:pPr>
-            <w:r>
-              <w:drawing>
-                <wp:inline xmlns:a="http://schemas.openxmlformats.org/drawingml/2006/main" xmlns:pic="http://schemas.openxmlformats.org/drawingml/2006/picture">
-                  <wp:extent cx="2880360" cy="2880360"/>
-                  <wp:docPr id="2" name="Picture 2"/>
-                  <wp:cNvGraphicFramePr>
-                    <a:graphicFrameLocks noChangeAspect="1"/>
-                  </wp:cNvGraphicFramePr>
-                  <a:graphic>
-                    <a:graphicData uri="http://schemas.openxmlformats.org/drawingml/2006/picture">
-                      <pic:pic>
-                        <pic:nvPicPr>
-                          <pic:cNvPr id="0" name="foto01.jpg"/>
-                          <pic:cNvPicPr/>
-                        </pic:nvPicPr>
-                        <pic:blipFill>
-                          <a:blip r:embed="rId10"/>
-                          <a:stretch>
-                            <a:fillRect/>
-                          </a:stretch>
-                        </pic:blipFill>
-                        <pic:spPr>
-                          <a:xfrm>
-                            <a:off x="0" y="0"/>
-                            <a:ext cx="2880360" cy="2880360"/>
-                          </a:xfrm>
-                          <a:prstGeom prst="rect"/>
-                        </pic:spPr>
-                      </pic:pic>
-                    </a:graphicData>
-                  </a:graphic>
-                </wp:inline>
-              </w:drawing>
-            </w:r>
           </w:p>
         </w:tc>
         <w:tc>
@@ -3408,40 +3360,6 @@
               <w:ind w:left="0" w:firstLine="0"/>
               <w:jc w:val="center"/>
             </w:pPr>
-            <w:r>
-              <w:drawing>
-                <wp:inline xmlns:a="http://schemas.openxmlformats.org/drawingml/2006/main" xmlns:pic="http://schemas.openxmlformats.org/drawingml/2006/picture">
-                  <wp:extent cx="2880360" cy="2880360"/>
-                  <wp:docPr id="3" name="Picture 3"/>
-                  <wp:cNvGraphicFramePr>
-                    <a:graphicFrameLocks noChangeAspect="1"/>
-                  </wp:cNvGraphicFramePr>
-                  <a:graphic>
-                    <a:graphicData uri="http://schemas.openxmlformats.org/drawingml/2006/picture">
-                      <pic:pic>
-                        <pic:nvPicPr>
-                          <pic:cNvPr id="0" name="foto01.jpg"/>
-                          <pic:cNvPicPr/>
-                        </pic:nvPicPr>
-                        <pic:blipFill>
-                          <a:blip r:embed="rId10"/>
-                          <a:stretch>
-                            <a:fillRect/>
-                          </a:stretch>
-                        </pic:blipFill>
-                        <pic:spPr>
-                          <a:xfrm>
-                            <a:off x="0" y="0"/>
-                            <a:ext cx="2880360" cy="2880360"/>
-                          </a:xfrm>
-                          <a:prstGeom prst="rect"/>
-                        </pic:spPr>
-                      </pic:pic>
-                    </a:graphicData>
-                  </a:graphic>
-                </wp:inline>
-              </w:drawing>
-            </w:r>
           </w:p>
         </w:tc>
         <w:tc>
@@ -3454,40 +3372,6 @@
               <w:ind w:left="0" w:firstLine="0"/>
               <w:jc w:val="center"/>
             </w:pPr>
-            <w:r>
-              <w:drawing>
-                <wp:inline xmlns:a="http://schemas.openxmlformats.org/drawingml/2006/main" xmlns:pic="http://schemas.openxmlformats.org/drawingml/2006/picture">
-                  <wp:extent cx="2880360" cy="2880360"/>
-                  <wp:docPr id="4" name="Picture 4"/>
-                  <wp:cNvGraphicFramePr>
-                    <a:graphicFrameLocks noChangeAspect="1"/>
-                  </wp:cNvGraphicFramePr>
-                  <a:graphic>
-                    <a:graphicData uri="http://schemas.openxmlformats.org/drawingml/2006/picture">
-                      <pic:pic>
-                        <pic:nvPicPr>
-                          <pic:cNvPr id="0" name="foto01.jpg"/>
-                          <pic:cNvPicPr/>
-                        </pic:nvPicPr>
-                        <pic:blipFill>
-                          <a:blip r:embed="rId10"/>
-                          <a:stretch>
-                            <a:fillRect/>
-                          </a:stretch>
-                        </pic:blipFill>
-                        <pic:spPr>
-                          <a:xfrm>
-                            <a:off x="0" y="0"/>
-                            <a:ext cx="2880360" cy="2880360"/>
-                          </a:xfrm>
-                          <a:prstGeom prst="rect"/>
-                        </pic:spPr>
-                      </pic:pic>
-                    </a:graphicData>
-                  </a:graphic>
-                </wp:inline>
-              </w:drawing>
-            </w:r>
           </w:p>
         </w:tc>
       </w:tr>
@@ -3542,40 +3426,6 @@
               <w:ind w:left="0" w:firstLine="0"/>
               <w:jc w:val="center"/>
             </w:pPr>
-            <w:r>
-              <w:drawing>
-                <wp:inline xmlns:a="http://schemas.openxmlformats.org/drawingml/2006/main" xmlns:pic="http://schemas.openxmlformats.org/drawingml/2006/picture">
-                  <wp:extent cx="2880360" cy="2880360"/>
-                  <wp:docPr id="5" name="Picture 5"/>
-                  <wp:cNvGraphicFramePr>
-                    <a:graphicFrameLocks noChangeAspect="1"/>
-                  </wp:cNvGraphicFramePr>
-                  <a:graphic>
-                    <a:graphicData uri="http://schemas.openxmlformats.org/drawingml/2006/picture">
-                      <pic:pic>
-                        <pic:nvPicPr>
-                          <pic:cNvPr id="0" name="foto01.jpg"/>
-                          <pic:cNvPicPr/>
-                        </pic:nvPicPr>
-                        <pic:blipFill>
-                          <a:blip r:embed="rId10"/>
-                          <a:stretch>
-                            <a:fillRect/>
-                          </a:stretch>
-                        </pic:blipFill>
-                        <pic:spPr>
-                          <a:xfrm>
-                            <a:off x="0" y="0"/>
-                            <a:ext cx="2880360" cy="2880360"/>
-                          </a:xfrm>
-                          <a:prstGeom prst="rect"/>
-                        </pic:spPr>
-                      </pic:pic>
-                    </a:graphicData>
-                  </a:graphic>
-                </wp:inline>
-              </w:drawing>
-            </w:r>
           </w:p>
         </w:tc>
         <w:tc>
@@ -3588,40 +3438,6 @@
               <w:ind w:left="0" w:firstLine="0"/>
               <w:jc w:val="center"/>
             </w:pPr>
-            <w:r>
-              <w:drawing>
-                <wp:inline xmlns:a="http://schemas.openxmlformats.org/drawingml/2006/main" xmlns:pic="http://schemas.openxmlformats.org/drawingml/2006/picture">
-                  <wp:extent cx="2880360" cy="2880360"/>
-                  <wp:docPr id="6" name="Picture 6"/>
-                  <wp:cNvGraphicFramePr>
-                    <a:graphicFrameLocks noChangeAspect="1"/>
-                  </wp:cNvGraphicFramePr>
-                  <a:graphic>
-                    <a:graphicData uri="http://schemas.openxmlformats.org/drawingml/2006/picture">
-                      <pic:pic>
-                        <pic:nvPicPr>
-                          <pic:cNvPr id="0" name="foto01.jpg"/>
-                          <pic:cNvPicPr/>
-                        </pic:nvPicPr>
-                        <pic:blipFill>
-                          <a:blip r:embed="rId10"/>
-                          <a:stretch>
-                            <a:fillRect/>
-                          </a:stretch>
-                        </pic:blipFill>
-                        <pic:spPr>
-                          <a:xfrm>
-                            <a:off x="0" y="0"/>
-                            <a:ext cx="2880360" cy="2880360"/>
-                          </a:xfrm>
-                          <a:prstGeom prst="rect"/>
-                        </pic:spPr>
-                      </pic:pic>
-                    </a:graphicData>
-                  </a:graphic>
-                </wp:inline>
-              </w:drawing>
-            </w:r>
           </w:p>
         </w:tc>
       </w:tr>
@@ -3676,40 +3492,6 @@
               <w:ind w:left="0" w:firstLine="0"/>
               <w:jc w:val="center"/>
             </w:pPr>
-            <w:r>
-              <w:drawing>
-                <wp:inline xmlns:a="http://schemas.openxmlformats.org/drawingml/2006/main" xmlns:pic="http://schemas.openxmlformats.org/drawingml/2006/picture">
-                  <wp:extent cx="2880360" cy="2880360"/>
-                  <wp:docPr id="7" name="Picture 7"/>
-                  <wp:cNvGraphicFramePr>
-                    <a:graphicFrameLocks noChangeAspect="1"/>
-                  </wp:cNvGraphicFramePr>
-                  <a:graphic>
-                    <a:graphicData uri="http://schemas.openxmlformats.org/drawingml/2006/picture">
-                      <pic:pic>
-                        <pic:nvPicPr>
-                          <pic:cNvPr id="0" name="foto01.jpg"/>
-                          <pic:cNvPicPr/>
-                        </pic:nvPicPr>
-                        <pic:blipFill>
-                          <a:blip r:embed="rId10"/>
-                          <a:stretch>
-                            <a:fillRect/>
-                          </a:stretch>
-                        </pic:blipFill>
-                        <pic:spPr>
-                          <a:xfrm>
-                            <a:off x="0" y="0"/>
-                            <a:ext cx="2880360" cy="2880360"/>
-                          </a:xfrm>
-                          <a:prstGeom prst="rect"/>
-                        </pic:spPr>
-                      </pic:pic>
-                    </a:graphicData>
-                  </a:graphic>
-                </wp:inline>
-              </w:drawing>
-            </w:r>
           </w:p>
         </w:tc>
         <w:tc>
@@ -3722,40 +3504,6 @@
               <w:ind w:left="0" w:firstLine="0"/>
               <w:jc w:val="center"/>
             </w:pPr>
-            <w:r>
-              <w:drawing>
-                <wp:inline xmlns:a="http://schemas.openxmlformats.org/drawingml/2006/main" xmlns:pic="http://schemas.openxmlformats.org/drawingml/2006/picture">
-                  <wp:extent cx="2880360" cy="2880360"/>
-                  <wp:docPr id="8" name="Picture 8"/>
-                  <wp:cNvGraphicFramePr>
-                    <a:graphicFrameLocks noChangeAspect="1"/>
-                  </wp:cNvGraphicFramePr>
-                  <a:graphic>
-                    <a:graphicData uri="http://schemas.openxmlformats.org/drawingml/2006/picture">
-                      <pic:pic>
-                        <pic:nvPicPr>
-                          <pic:cNvPr id="0" name="foto01.jpg"/>
-                          <pic:cNvPicPr/>
-                        </pic:nvPicPr>
-                        <pic:blipFill>
-                          <a:blip r:embed="rId10"/>
-                          <a:stretch>
-                            <a:fillRect/>
-                          </a:stretch>
-                        </pic:blipFill>
-                        <pic:spPr>
-                          <a:xfrm>
-                            <a:off x="0" y="0"/>
-                            <a:ext cx="2880360" cy="2880360"/>
-                          </a:xfrm>
-                          <a:prstGeom prst="rect"/>
-                        </pic:spPr>
-                      </pic:pic>
-                    </a:graphicData>
-                  </a:graphic>
-                </wp:inline>
-              </w:drawing>
-            </w:r>
           </w:p>
         </w:tc>
       </w:tr>
@@ -3810,40 +3558,6 @@
               <w:ind w:left="0" w:firstLine="0"/>
               <w:jc w:val="center"/>
             </w:pPr>
-            <w:r>
-              <w:drawing>
-                <wp:inline xmlns:a="http://schemas.openxmlformats.org/drawingml/2006/main" xmlns:pic="http://schemas.openxmlformats.org/drawingml/2006/picture">
-                  <wp:extent cx="2880360" cy="2880360"/>
-                  <wp:docPr id="9" name="Picture 9"/>
-                  <wp:cNvGraphicFramePr>
-                    <a:graphicFrameLocks noChangeAspect="1"/>
-                  </wp:cNvGraphicFramePr>
-                  <a:graphic>
-                    <a:graphicData uri="http://schemas.openxmlformats.org/drawingml/2006/picture">
-                      <pic:pic>
-                        <pic:nvPicPr>
-                          <pic:cNvPr id="0" name="foto01.jpg"/>
-                          <pic:cNvPicPr/>
-                        </pic:nvPicPr>
-                        <pic:blipFill>
-                          <a:blip r:embed="rId10"/>
-                          <a:stretch>
-                            <a:fillRect/>
-                          </a:stretch>
-                        </pic:blipFill>
-                        <pic:spPr>
-                          <a:xfrm>
-                            <a:off x="0" y="0"/>
-                            <a:ext cx="2880360" cy="2880360"/>
-                          </a:xfrm>
-                          <a:prstGeom prst="rect"/>
-                        </pic:spPr>
-                      </pic:pic>
-                    </a:graphicData>
-                  </a:graphic>
-                </wp:inline>
-              </w:drawing>
-            </w:r>
           </w:p>
         </w:tc>
         <w:tc>
@@ -3856,40 +3570,6 @@
               <w:ind w:left="0" w:firstLine="0"/>
               <w:jc w:val="center"/>
             </w:pPr>
-            <w:r>
-              <w:drawing>
-                <wp:inline xmlns:a="http://schemas.openxmlformats.org/drawingml/2006/main" xmlns:pic="http://schemas.openxmlformats.org/drawingml/2006/picture">
-                  <wp:extent cx="2880360" cy="2880360"/>
-                  <wp:docPr id="10" name="Picture 10"/>
-                  <wp:cNvGraphicFramePr>
-                    <a:graphicFrameLocks noChangeAspect="1"/>
-                  </wp:cNvGraphicFramePr>
-                  <a:graphic>
-                    <a:graphicData uri="http://schemas.openxmlformats.org/drawingml/2006/picture">
-                      <pic:pic>
-                        <pic:nvPicPr>
-                          <pic:cNvPr id="0" name="foto01.jpg"/>
-                          <pic:cNvPicPr/>
-                        </pic:nvPicPr>
-                        <pic:blipFill>
-                          <a:blip r:embed="rId10"/>
-                          <a:stretch>
-                            <a:fillRect/>
-                          </a:stretch>
-                        </pic:blipFill>
-                        <pic:spPr>
-                          <a:xfrm>
-                            <a:off x="0" y="0"/>
-                            <a:ext cx="2880360" cy="2880360"/>
-                          </a:xfrm>
-                          <a:prstGeom prst="rect"/>
-                        </pic:spPr>
-                      </pic:pic>
-                    </a:graphicData>
-                  </a:graphic>
-                </wp:inline>
-              </w:drawing>
-            </w:r>
           </w:p>
         </w:tc>
       </w:tr>
@@ -3959,9 +3639,11 @@
         <w:t>Nenhum registro fotográfico de ponto de atenção cadastrado.</w:t>
       </w:r>
     </w:p>
+    <w:p/>
     <w:p>
       <w:pPr>
-        <w:spacing w:before="240" w:after="240"/>
+        <w:spacing w:before="240" w:after="480"/>
+        <w:jc w:val="center"/>
       </w:pPr>
       <w:r>
         <w:rPr>
@@ -3971,7 +3653,6 @@
         <w:t>Recife, data da assinatura eletrônica.</w:t>
       </w:r>
     </w:p>
-    <w:p/>
     <w:p/>
     <w:p>
       <w:pPr>
@@ -4057,7 +3738,8 @@
     <w:p/>
     <w:p>
       <w:pPr>
-        <w:spacing w:before="240" w:after="240"/>
+        <w:spacing w:before="720" w:after="720"/>
+        <w:jc w:val="center"/>
       </w:pPr>
       <w:r>
         <w:rPr>
@@ -4067,7 +3749,6 @@
         <w:t>Ciente e de acordo.</w:t>
       </w:r>
     </w:p>
-    <w:p/>
     <w:p>
       <w:pPr>
         <w:spacing w:after="0"/>

</xml_diff>